<commit_message>
release-check 2.3.0: eigene Modelldatei zählt nur geprüft (sonst Bundle); select_link aus fremdem Dossier nur als zotero://select; Whisper-Modell/Sprechertrennung aus who in den Schicht-Kopf; Zotero-Status sucht nur mit Einwilligung; .enrich.zip in allen Import-Wegen; Doppelklick auf .enrich importiert (RunEvent::Opened + Frontend); Zotero-Rollen offen; Blätter 4.5 nennen E-Mail und Zotero-Metadaten, fr/it .qdpx.zip; README/CHANGELOG/Site-Texte; Lockfiles 2.3.0
Co-Authored-By: Claude Fable 5.1 <noreply@anthropic.com>
Claude-Session: https://claude.ai/code/session_01VhoDoDyamQwRzZ3dqypMTk
</commit_message>
<xml_diff>
--- a/site/docs/localtranscript-data-processing-en.docx
+++ b/site/docs/localtranscript-data-processing-en.docx
@@ -558,7 +558,46 @@
         <w:t xml:space="preserve"> </w:t>
       </w:r>
       <w:r>
-        <w:t xml:space="preserve">Passing them on is passing on the recording.</w:t>
+        <w:t xml:space="preserve">Passing them on is passing on the recording. An enrich dossier also</w:t>
+      </w:r>
+      <w:r>
+        <w:t xml:space="preserve"> </w:t>
+      </w:r>
+      <w:r>
+        <w:t xml:space="preserve">contains the change journal with the optional e-mail address entered</w:t>
+      </w:r>
+      <w:r>
+        <w:t xml:space="preserve"> </w:t>
+      </w:r>
+      <w:r>
+        <w:t xml:space="preserve">in Settings and, if the transcript is linked to Zotero, the adopted</w:t>
+      </w:r>
+      <w:r>
+        <w:t xml:space="preserve"> </w:t>
+      </w:r>
+      <w:r>
+        <w:t xml:space="preserve">metadata (title, date, people by the chosen roles, citation key).</w:t>
+      </w:r>
+      <w:r>
+        <w:t xml:space="preserve"> </w:t>
+      </w:r>
+      <w:r>
+        <w:t xml:space="preserve">With Zotero consent the application reads the local</w:t>
+      </w:r>
+      <w:r>
+        <w:t xml:space="preserve"> </w:t>
+      </w:r>
+      <w:r>
+        <w:rPr>
+          <w:rStyle w:val="VerbatimChar"/>
+        </w:rPr>
+        <w:t xml:space="preserve">zotero.sqlite</w:t>
+      </w:r>
+      <w:r>
+        <w:t xml:space="preserve"> </w:t>
+      </w:r>
+      <w:r>
+        <w:t xml:space="preserve">read-only and only on request.</w:t>
       </w:r>
     </w:p>
     <w:bookmarkEnd w:id="13"/>

</xml_diff>

<commit_message>
video als Quelle (BACKLOG 8): MP4/MOV/M4V mit H.264/HEVC angenommen, nie umgewandelt, 10-GB-Grenze, fremde Codecs abgewiesen mit Hinweis; Ton nach mp3, Video unverändert im Eintrag; Bild stumm unter den Sprechern — Ton führt, Bild folgt, eingefroren ab 2× und bei Sprüngen; Video-Route mit Range; REFI-QDA «mit Video» (VideoSource); enrich bleibt Ton; Blätter ×4, README, CHANGELOG; 5 Tests (ffmpeg-Fixtures), geprüft in Chromium und WebKit
Co-Authored-By: Claude Fable 5.1 <noreply@anthropic.com>
Claude-Session: https://claude.ai/code/session_01VhoDoDyamQwRzZ3dqypMTk
</commit_message>
<xml_diff>
--- a/site/docs/localtranscript-data-processing-en.docx
+++ b/site/docs/localtranscript-data-processing-en.docx
@@ -597,7 +597,31 @@
         <w:t xml:space="preserve"> </w:t>
       </w:r>
       <w:r>
-        <w:t xml:space="preserve">read-only and only on request.</w:t>
+        <w:t xml:space="preserve">read-only and only on request. For a video recording the video file</w:t>
+      </w:r>
+      <w:r>
+        <w:t xml:space="preserve"> </w:t>
+      </w:r>
+      <w:r>
+        <w:t xml:space="preserve">is stored unchanged in the transcript's folder (faces are personal</w:t>
+      </w:r>
+      <w:r>
+        <w:t xml:space="preserve"> </w:t>
+      </w:r>
+      <w:r>
+        <w:t xml:space="preserve">and, where identifiable, biometric data); the enrich export carries</w:t>
+      </w:r>
+      <w:r>
+        <w:t xml:space="preserve"> </w:t>
+      </w:r>
+      <w:r>
+        <w:t xml:space="preserve">the sound only, the REFI-QDA export the video only when chosen</w:t>
+      </w:r>
+      <w:r>
+        <w:t xml:space="preserve"> </w:t>
+      </w:r>
+      <w:r>
+        <w:t xml:space="preserve">explicitly.</w:t>
       </w:r>
     </w:p>
     <w:bookmarkEnd w:id="13"/>

</xml_diff>

<commit_message>
Blätter ×4: Datenfluss Eingabe/Ablage nennen Video (Tonspur als MP3, Videodatei unverändert)
Co-Authored-By: Claude Fable 5.1 <noreply@anthropic.com>
Claude-Session: https://claude.ai/code/session_01VhoDoDyamQwRzZ3dqypMTk
</commit_message>
<xml_diff>
--- a/site/docs/localtranscript-data-processing-en.docx
+++ b/site/docs/localtranscript-data-processing-en.docx
@@ -292,13 +292,25 @@
         <w:t xml:space="preserve"> </w:t>
       </w:r>
       <w:r>
-        <w:t xml:space="preserve">The audio file is read from the local file system of the</w:t>
-      </w:r>
-      <w:r>
-        <w:t xml:space="preserve"> </w:t>
-      </w:r>
-      <w:r>
-        <w:t xml:space="preserve">device (MP3, WAV, M4A, OGG, FLAC).</w:t>
+        <w:t xml:space="preserve">The audio or video file is read from the local file</w:t>
+      </w:r>
+      <w:r>
+        <w:t xml:space="preserve"> </w:t>
+      </w:r>
+      <w:r>
+        <w:t xml:space="preserve">system of the device (audio: MP3, WAV, M4A, OGG, FLAC; video: MP4,</w:t>
+      </w:r>
+      <w:r>
+        <w:t xml:space="preserve"> </w:t>
+      </w:r>
+      <w:r>
+        <w:t xml:space="preserve">MOV, M4V with H.264/HEVC — from video only the sound track is read,</w:t>
+      </w:r>
+      <w:r>
+        <w:t xml:space="preserve"> </w:t>
+      </w:r>
+      <w:r>
+        <w:t xml:space="preserve">the video is never transcoded).</w:t>
       </w:r>
     </w:p>
     <w:p>
@@ -405,7 +417,13 @@
         <w:t xml:space="preserve"> </w:t>
       </w:r>
       <w:r>
-        <w:t xml:space="preserve">the audio, the canonical transcript file (JSON), history snapshots</w:t>
+        <w:t xml:space="preserve">the audio (for video: the sound track as MP3 and the unchanged video</w:t>
+      </w:r>
+      <w:r>
+        <w:t xml:space="preserve"> </w:t>
+      </w:r>
+      <w:r>
+        <w:t xml:space="preserve">file), the canonical transcript file (JSON), history snapshots</w:t>
       </w:r>
       <w:r>
         <w:t xml:space="preserve"> </w:t>

</xml_diff>